<commit_message>
Weeks 2,4,5,6 and Lab modified
</commit_message>
<xml_diff>
--- a/lectures/week02/Week2_Lecture.docx
+++ b/lectures/week02/Week2_Lecture.docx
@@ -609,12 +609,6 @@
         <w:gridCol w:w="9360"/>
       </w:tblGrid>
       <w:tr>
-        <w:tblPrEx>
-          <w:tblCellMar>
-            <w:top w:w="0" w:type="dxa"/>
-            <w:bottom w:w="0" w:type="dxa"/>
-          </w:tblCellMar>
-        </w:tblPrEx>
         <w:tc>
           <w:tcPr>
             <w:tcW w:w="9360" w:type="dxa"/>
@@ -978,12 +972,6 @@
         <w:gridCol w:w="9360"/>
       </w:tblGrid>
       <w:tr>
-        <w:tblPrEx>
-          <w:tblCellMar>
-            <w:top w:w="0" w:type="dxa"/>
-            <w:bottom w:w="0" w:type="dxa"/>
-          </w:tblCellMar>
-        </w:tblPrEx>
         <w:tc>
           <w:tcPr>
             <w:tcW w:w="9360" w:type="dxa"/>
@@ -1346,12 +1334,6 @@
         <w:gridCol w:w="9360"/>
       </w:tblGrid>
       <w:tr>
-        <w:tblPrEx>
-          <w:tblCellMar>
-            <w:top w:w="0" w:type="dxa"/>
-            <w:bottom w:w="0" w:type="dxa"/>
-          </w:tblCellMar>
-        </w:tblPrEx>
         <w:tc>
           <w:tcPr>
             <w:tcW w:w="9360" w:type="dxa"/>
@@ -1398,7 +1380,10 @@
               <w:t>actuator redundancy</w:t>
             </w:r>
             <w:r>
-              <w:t>: there are infinitely many combinations of muscle forces that produce the same net joint torques. For example, co-contracting the shoulder flexor and extensor produces no net torque but increases joint stiffness. This is distinct from the kinematic redundancy discussed in Week 1 (which our 2-DOF model does not have). We will encounter this actuator redundancy directly in Week 5 (Inverse Dynamics) and Week 6 (Static Optimization).</w:t>
+              <w:t xml:space="preserve">: there are infinitely many combinations of muscle forces that produce the same net joint torques. For example, co-contracting the shoulder flexor and extensor produces no net torque but increases joint stiffness. This is distinct from the kinematic redundancy discussed in Week 1 (which our 2-DOF model does not have). </w:t>
+            </w:r>
+            <w:r>
+              <w:t>We will encounter this actuator redundancy directly in Week 6 (Inverse Dynamics &amp; Static Optimization).</w:t>
             </w:r>
           </w:p>
         </w:tc>
@@ -1579,12 +1564,6 @@
         <w:gridCol w:w="9360"/>
       </w:tblGrid>
       <w:tr>
-        <w:tblPrEx>
-          <w:tblCellMar>
-            <w:top w:w="0" w:type="dxa"/>
-            <w:bottom w:w="0" w:type="dxa"/>
-          </w:tblCellMar>
-        </w:tblPrEx>
         <w:tc>
           <w:tcPr>
             <w:tcW w:w="9360" w:type="dxa"/>
@@ -1901,12 +1880,6 @@
         <w:gridCol w:w="2960"/>
       </w:tblGrid>
       <w:tr>
-        <w:tblPrEx>
-          <w:tblCellMar>
-            <w:top w:w="0" w:type="dxa"/>
-            <w:bottom w:w="0" w:type="dxa"/>
-          </w:tblCellMar>
-        </w:tblPrEx>
         <w:tc>
           <w:tcPr>
             <w:tcW w:w="2800" w:type="dxa"/>
@@ -2033,12 +2006,6 @@
         </w:tc>
       </w:tr>
       <w:tr>
-        <w:tblPrEx>
-          <w:tblCellMar>
-            <w:top w:w="0" w:type="dxa"/>
-            <w:bottom w:w="0" w:type="dxa"/>
-          </w:tblCellMar>
-        </w:tblPrEx>
         <w:tc>
           <w:tcPr>
             <w:tcW w:w="2800" w:type="dxa"/>
@@ -2149,12 +2116,6 @@
         </w:tc>
       </w:tr>
       <w:tr>
-        <w:tblPrEx>
-          <w:tblCellMar>
-            <w:top w:w="0" w:type="dxa"/>
-            <w:bottom w:w="0" w:type="dxa"/>
-          </w:tblCellMar>
-        </w:tblPrEx>
         <w:tc>
           <w:tcPr>
             <w:tcW w:w="2800" w:type="dxa"/>
@@ -2261,12 +2222,6 @@
         </w:tc>
       </w:tr>
       <w:tr>
-        <w:tblPrEx>
-          <w:tblCellMar>
-            <w:top w:w="0" w:type="dxa"/>
-            <w:bottom w:w="0" w:type="dxa"/>
-          </w:tblCellMar>
-        </w:tblPrEx>
         <w:tc>
           <w:tcPr>
             <w:tcW w:w="2800" w:type="dxa"/>
@@ -2377,12 +2332,6 @@
         </w:tc>
       </w:tr>
       <w:tr>
-        <w:tblPrEx>
-          <w:tblCellMar>
-            <w:top w:w="0" w:type="dxa"/>
-            <w:bottom w:w="0" w:type="dxa"/>
-          </w:tblCellMar>
-        </w:tblPrEx>
         <w:tc>
           <w:tcPr>
             <w:tcW w:w="2800" w:type="dxa"/>
@@ -2489,12 +2438,6 @@
         </w:tc>
       </w:tr>
       <w:tr>
-        <w:tblPrEx>
-          <w:tblCellMar>
-            <w:top w:w="0" w:type="dxa"/>
-            <w:bottom w:w="0" w:type="dxa"/>
-          </w:tblCellMar>
-        </w:tblPrEx>
         <w:tc>
           <w:tcPr>
             <w:tcW w:w="2800" w:type="dxa"/>
@@ -2605,12 +2548,6 @@
         </w:tc>
       </w:tr>
       <w:tr>
-        <w:tblPrEx>
-          <w:tblCellMar>
-            <w:top w:w="0" w:type="dxa"/>
-            <w:bottom w:w="0" w:type="dxa"/>
-          </w:tblCellMar>
-        </w:tblPrEx>
         <w:tc>
           <w:tcPr>
             <w:tcW w:w="2800" w:type="dxa"/>
@@ -3174,12 +3111,6 @@
         <w:gridCol w:w="9360"/>
       </w:tblGrid>
       <w:tr>
-        <w:tblPrEx>
-          <w:tblCellMar>
-            <w:top w:w="0" w:type="dxa"/>
-            <w:bottom w:w="0" w:type="dxa"/>
-          </w:tblCellMar>
-        </w:tblPrEx>
         <w:tc>
           <w:tcPr>
             <w:tcW w:w="9360" w:type="dxa"/>
@@ -3730,12 +3661,6 @@
         <w:gridCol w:w="4680"/>
       </w:tblGrid>
       <w:tr>
-        <w:tblPrEx>
-          <w:tblCellMar>
-            <w:top w:w="0" w:type="dxa"/>
-            <w:bottom w:w="0" w:type="dxa"/>
-          </w:tblCellMar>
-        </w:tblPrEx>
         <w:tc>
           <w:tcPr>
             <w:tcW w:w="4680" w:type="dxa"/>
@@ -3800,12 +3725,6 @@
         </w:tc>
       </w:tr>
       <w:tr>
-        <w:tblPrEx>
-          <w:tblCellMar>
-            <w:top w:w="0" w:type="dxa"/>
-            <w:bottom w:w="0" w:type="dxa"/>
-          </w:tblCellMar>
-        </w:tblPrEx>
         <w:tc>
           <w:tcPr>
             <w:tcW w:w="4680" w:type="dxa"/>
@@ -3862,12 +3781,6 @@
         </w:tc>
       </w:tr>
       <w:tr>
-        <w:tblPrEx>
-          <w:tblCellMar>
-            <w:top w:w="0" w:type="dxa"/>
-            <w:bottom w:w="0" w:type="dxa"/>
-          </w:tblCellMar>
-        </w:tblPrEx>
         <w:tc>
           <w:tcPr>
             <w:tcW w:w="4680" w:type="dxa"/>
@@ -3922,12 +3835,6 @@
         </w:tc>
       </w:tr>
       <w:tr>
-        <w:tblPrEx>
-          <w:tblCellMar>
-            <w:top w:w="0" w:type="dxa"/>
-            <w:bottom w:w="0" w:type="dxa"/>
-          </w:tblCellMar>
-        </w:tblPrEx>
         <w:tc>
           <w:tcPr>
             <w:tcW w:w="4680" w:type="dxa"/>
@@ -3984,12 +3891,6 @@
         </w:tc>
       </w:tr>
       <w:tr>
-        <w:tblPrEx>
-          <w:tblCellMar>
-            <w:top w:w="0" w:type="dxa"/>
-            <w:bottom w:w="0" w:type="dxa"/>
-          </w:tblCellMar>
-        </w:tblPrEx>
         <w:tc>
           <w:tcPr>
             <w:tcW w:w="4680" w:type="dxa"/>
@@ -4044,12 +3945,6 @@
         </w:tc>
       </w:tr>
       <w:tr>
-        <w:tblPrEx>
-          <w:tblCellMar>
-            <w:top w:w="0" w:type="dxa"/>
-            <w:bottom w:w="0" w:type="dxa"/>
-          </w:tblCellMar>
-        </w:tblPrEx>
         <w:tc>
           <w:tcPr>
             <w:tcW w:w="4680" w:type="dxa"/>
@@ -4106,12 +4001,6 @@
         </w:tc>
       </w:tr>
       <w:tr>
-        <w:tblPrEx>
-          <w:tblCellMar>
-            <w:top w:w="0" w:type="dxa"/>
-            <w:bottom w:w="0" w:type="dxa"/>
-          </w:tblCellMar>
-        </w:tblPrEx>
         <w:tc>
           <w:tcPr>
             <w:tcW w:w="4680" w:type="dxa"/>
@@ -4755,12 +4644,6 @@
         <w:gridCol w:w="9360"/>
       </w:tblGrid>
       <w:tr>
-        <w:tblPrEx>
-          <w:tblCellMar>
-            <w:top w:w="0" w:type="dxa"/>
-            <w:bottom w:w="0" w:type="dxa"/>
-          </w:tblCellMar>
-        </w:tblPrEx>
         <w:tc>
           <w:tcPr>
             <w:tcW w:w="9360" w:type="dxa"/>
@@ -4888,12 +4771,6 @@
         <w:gridCol w:w="3160"/>
       </w:tblGrid>
       <w:tr>
-        <w:tblPrEx>
-          <w:tblCellMar>
-            <w:top w:w="0" w:type="dxa"/>
-            <w:bottom w:w="0" w:type="dxa"/>
-          </w:tblCellMar>
-        </w:tblPrEx>
         <w:tc>
           <w:tcPr>
             <w:tcW w:w="3000" w:type="dxa"/>
@@ -4989,12 +4866,6 @@
         </w:tc>
       </w:tr>
       <w:tr>
-        <w:tblPrEx>
-          <w:tblCellMar>
-            <w:top w:w="0" w:type="dxa"/>
-            <w:bottom w:w="0" w:type="dxa"/>
-          </w:tblCellMar>
-        </w:tblPrEx>
         <w:tc>
           <w:tcPr>
             <w:tcW w:w="3000" w:type="dxa"/>
@@ -5094,12 +4965,6 @@
         </w:tc>
       </w:tr>
       <w:tr>
-        <w:tblPrEx>
-          <w:tblCellMar>
-            <w:top w:w="0" w:type="dxa"/>
-            <w:bottom w:w="0" w:type="dxa"/>
-          </w:tblCellMar>
-        </w:tblPrEx>
         <w:tc>
           <w:tcPr>
             <w:tcW w:w="3000" w:type="dxa"/>
@@ -5189,12 +5054,6 @@
         </w:tc>
       </w:tr>
       <w:tr>
-        <w:tblPrEx>
-          <w:tblCellMar>
-            <w:top w:w="0" w:type="dxa"/>
-            <w:bottom w:w="0" w:type="dxa"/>
-          </w:tblCellMar>
-        </w:tblPrEx>
         <w:tc>
           <w:tcPr>
             <w:tcW w:w="3000" w:type="dxa"/>
@@ -5287,12 +5146,6 @@
         </w:tc>
       </w:tr>
       <w:tr>
-        <w:tblPrEx>
-          <w:tblCellMar>
-            <w:top w:w="0" w:type="dxa"/>
-            <w:bottom w:w="0" w:type="dxa"/>
-          </w:tblCellMar>
-        </w:tblPrEx>
         <w:tc>
           <w:tcPr>
             <w:tcW w:w="3000" w:type="dxa"/>
@@ -5398,12 +5251,6 @@
         </w:tc>
       </w:tr>
       <w:tr>
-        <w:tblPrEx>
-          <w:tblCellMar>
-            <w:top w:w="0" w:type="dxa"/>
-            <w:bottom w:w="0" w:type="dxa"/>
-          </w:tblCellMar>
-        </w:tblPrEx>
         <w:tc>
           <w:tcPr>
             <w:tcW w:w="3000" w:type="dxa"/>
@@ -5487,12 +5334,6 @@
         </w:tc>
       </w:tr>
       <w:tr>
-        <w:tblPrEx>
-          <w:tblCellMar>
-            <w:top w:w="0" w:type="dxa"/>
-            <w:bottom w:w="0" w:type="dxa"/>
-          </w:tblCellMar>
-        </w:tblPrEx>
         <w:tc>
           <w:tcPr>
             <w:tcW w:w="3000" w:type="dxa"/>
@@ -5573,12 +5414,6 @@
         </w:tc>
       </w:tr>
       <w:tr>
-        <w:tblPrEx>
-          <w:tblCellMar>
-            <w:top w:w="0" w:type="dxa"/>
-            <w:bottom w:w="0" w:type="dxa"/>
-          </w:tblCellMar>
-        </w:tblPrEx>
         <w:tc>
           <w:tcPr>
             <w:tcW w:w="3000" w:type="dxa"/>
@@ -6845,6 +6680,13 @@
       <w:szCs w:val="20"/>
     </w:rPr>
   </w:style>
+  <w:style w:type="paragraph" w:styleId="Revision">
+    <w:name w:val="Revision"/>
+    <w:hidden/>
+    <w:uiPriority w:val="99"/>
+    <w:semiHidden/>
+    <w:rsid w:val="005056A3"/>
+  </w:style>
 </w:styles>
 </file>
 

</xml_diff>

<commit_message>
Week 2 lecture updated
</commit_message>
<xml_diff>
--- a/lectures/week02/Week2_Lecture.docx
+++ b/lectures/week02/Week2_Lecture.docx
@@ -1,6 +1,6 @@
 
 <file path=word/document.xml><?xml version="1.0" encoding="utf-8"?>
-<w:document xmlns:wpc="http://schemas.microsoft.com/office/word/2010/wordprocessingCanvas" xmlns:cx="http://schemas.microsoft.com/office/drawing/2014/chartex" xmlns:cx1="http://schemas.microsoft.com/office/drawing/2015/9/8/chartex" xmlns:cx2="http://schemas.microsoft.com/office/drawing/2015/10/21/chartex" xmlns:cx3="http://schemas.microsoft.com/office/drawing/2016/5/9/chartex" xmlns:cx4="http://schemas.microsoft.com/office/drawing/2016/5/10/chartex" xmlns:cx5="http://schemas.microsoft.com/office/drawing/2016/5/11/chartex" xmlns:cx6="http://schemas.microsoft.com/office/drawing/2016/5/12/chartex" xmlns:cx7="http://schemas.microsoft.com/office/drawing/2016/5/13/chartex" xmlns:cx8="http://schemas.microsoft.com/office/drawing/2016/5/14/chartex" xmlns:mc="http://schemas.openxmlformats.org/markup-compatibility/2006" xmlns:m="http://schemas.openxmlformats.org/officeDocument/2006/math" xmlns:aink="http://schemas.microsoft.com/office/drawing/2016/ink" xmlns:am3d="http://schemas.microsoft.com/office/drawing/2017/model3d" xmlns:oel="http://schemas.microsoft.com/office/2019/extlst" xmlns:r="http://schemas.openxmlformats.org/officeDocument/2006/relationships" xmlns:wp14="http://schemas.microsoft.com/office/word/2010/wordprocessingDrawing" xmlns:wp="http://schemas.openxmlformats.org/drawingml/2006/wordprocessingDrawing" xmlns:wpg="http://schemas.microsoft.com/office/word/2010/wordprocessingGroup" xmlns:wpi="http://schemas.microsoft.com/office/word/2010/wordprocessingInk" xmlns:wps="http://schemas.microsoft.com/office/word/2010/wordprocessingShape" xmlns:o="urn:schemas-microsoft-com:office:office" xmlns:v="urn:schemas-microsoft-com:vml" xmlns:w10="urn:schemas-microsoft-com:office:word" xmlns:w="http://schemas.openxmlformats.org/wordprocessingml/2006/main" xmlns:w14="http://schemas.microsoft.com/office/word/2010/wordml" xmlns:w15="http://schemas.microsoft.com/office/word/2012/wordml" xmlns:w16cei="http://schemas.microsoft.com/office/word/2026/wordml/cei" xmlns:w16cex="http://schemas.microsoft.com/office/word/2018/wordml/cex" xmlns:w16cid="http://schemas.microsoft.com/office/word/2016/wordml/cid" xmlns:w16="http://schemas.microsoft.com/office/word/2018/wordml" xmlns:w16sdtdh="http://schemas.microsoft.com/office/word/2020/wordml/sdtdatahash" xmlns:w16sdtfl="http://schemas.microsoft.com/office/word/2024/wordml/sdtformatlock" xmlns:w16se="http://schemas.microsoft.com/office/word/2015/wordml/symex" xmlns:w16du="http://schemas.microsoft.com/office/word/2023/wordml/word16du" xmlns:wne="http://schemas.microsoft.com/office/word/2006/wordml" mc:Ignorable="w14 w15 w16se w16cid w16 w16cex w16sdtdh w16sdtfl w16du wp14">
+<w:document xmlns:wpc="http://schemas.microsoft.com/office/word/2010/wordprocessingCanvas" xmlns:cx="http://schemas.microsoft.com/office/drawing/2014/chartex" xmlns:cx1="http://schemas.microsoft.com/office/drawing/2015/9/8/chartex" xmlns:cx2="http://schemas.microsoft.com/office/drawing/2015/10/21/chartex" xmlns:cx3="http://schemas.microsoft.com/office/drawing/2016/5/9/chartex" xmlns:cx4="http://schemas.microsoft.com/office/drawing/2016/5/10/chartex" xmlns:cx5="http://schemas.microsoft.com/office/drawing/2016/5/11/chartex" xmlns:cx6="http://schemas.microsoft.com/office/drawing/2016/5/12/chartex" xmlns:cx7="http://schemas.microsoft.com/office/drawing/2016/5/13/chartex" xmlns:cx8="http://schemas.microsoft.com/office/drawing/2016/5/14/chartex" xmlns:mc="http://schemas.openxmlformats.org/markup-compatibility/2006" xmlns:m="http://schemas.openxmlformats.org/officeDocument/2006/math" xmlns:aink="http://schemas.microsoft.com/office/drawing/2016/ink" xmlns:am3d="http://schemas.microsoft.com/office/drawing/2017/model3d" xmlns:oel="http://schemas.microsoft.com/office/2019/extlst" xmlns:r="http://schemas.openxmlformats.org/officeDocument/2006/relationships" xmlns:wp14="http://schemas.microsoft.com/office/word/2010/wordprocessingDrawing" xmlns:wp="http://schemas.openxmlformats.org/drawingml/2006/wordprocessingDrawing" xmlns:wpg="http://schemas.microsoft.com/office/word/2010/wordprocessingGroup" xmlns:wpi="http://schemas.microsoft.com/office/word/2010/wordprocessingInk" xmlns:wps="http://schemas.microsoft.com/office/word/2010/wordprocessingShape" xmlns:o="urn:schemas-microsoft-com:office:office" xmlns:v="urn:schemas-microsoft-com:vml" xmlns:w10="urn:schemas-microsoft-com:office:word" xmlns:w="http://schemas.openxmlformats.org/wordprocessingml/2006/main" xmlns:w14="http://schemas.microsoft.com/office/word/2010/wordml" xmlns:w15="http://schemas.microsoft.com/office/word/2012/wordml" xmlns:w16cex="http://schemas.microsoft.com/office/word/2018/wordml/cex" xmlns:w16cid="http://schemas.microsoft.com/office/word/2016/wordml/cid" xmlns:w16="http://schemas.microsoft.com/office/word/2018/wordml" xmlns:w16sdtdh="http://schemas.microsoft.com/office/word/2020/wordml/sdtdatahash" xmlns:w16sdtfl="http://schemas.microsoft.com/office/word/2024/wordml/sdtformatlock" xmlns:w16se="http://schemas.microsoft.com/office/word/2015/wordml/symex" xmlns:w16du="http://schemas.microsoft.com/office/word/2023/wordml/word16du" xmlns:wne="http://schemas.microsoft.com/office/word/2006/wordml" mc:Ignorable="w14 w15 w16se w16cid w16 w16cex w16sdtdh w16sdtfl w16du wp14">
   <w:body>
     <w:p>
       <w:pPr>
@@ -1504,6 +1504,7 @@
         <w:spacing w:after="160" w:line="300" w:lineRule="auto"/>
       </w:pPr>
       <w:r>
+        <w:lastRenderedPageBreak/>
         <w:t xml:space="preserve">For implementation, the moment arm at each joint is computed from the muscle’s origin and insertion points using the geometric relationship between muscle length and joint angle. The key implication: </w:t>
       </w:r>
       <w:r>
@@ -1566,7 +1567,6 @@
                 <w:bCs/>
                 <w:color w:val="2E86AB"/>
               </w:rPr>
-              <w:lastRenderedPageBreak/>
               <w:t>Moment Arms and Muscle Redundancy</w:t>
             </w:r>
           </w:p>
@@ -4242,7 +4242,43 @@
           <w:sz w:val="24"/>
           <w:szCs w:val="24"/>
         </w:rPr>
-        <w:t>τ² M̈ + 2τ Ṁ + M = M̃</w:t>
+        <w:t xml:space="preserve">τ² </w:t>
+      </w:r>
+      <m:oMath>
+        <m:acc>
+          <m:accPr>
+            <m:chr m:val="̈"/>
+            <m:ctrlPr>
+              <w:rPr>
+                <w:rFonts w:ascii="Cambria Math" w:eastAsia="Cambria Math" w:hAnsi="Cambria Math" w:cs="Cambria Math"/>
+                <w:i/>
+                <w:color w:val="1B2A4A"/>
+                <w:sz w:val="24"/>
+                <w:szCs w:val="24"/>
+              </w:rPr>
+            </m:ctrlPr>
+          </m:accPr>
+          <m:e>
+            <m:r>
+              <w:rPr>
+                <w:rFonts w:ascii="Cambria Math" w:eastAsia="Cambria Math" w:hAnsi="Cambria Math" w:cs="Cambria Math"/>
+                <w:color w:val="1B2A4A"/>
+                <w:sz w:val="24"/>
+                <w:szCs w:val="24"/>
+              </w:rPr>
+              <m:t>M</m:t>
+            </m:r>
+          </m:e>
+        </m:acc>
+      </m:oMath>
+      <w:r>
+        <w:rPr>
+          <w:rFonts w:ascii="Cambria Math" w:eastAsia="Cambria Math" w:hAnsi="Cambria Math" w:cs="Cambria Math"/>
+          <w:color w:val="1B2A4A"/>
+          <w:sz w:val="24"/>
+          <w:szCs w:val="24"/>
+        </w:rPr>
+        <w:t>+ 2τ Ṁ + M = M̃</w:t>
       </w:r>
       <w:r>
         <w:rPr>
@@ -5498,7 +5534,7 @@
 </file>
 
 <file path=word/endnotes.xml><?xml version="1.0" encoding="utf-8"?>
-<w:endnotes xmlns:wpc="http://schemas.microsoft.com/office/word/2010/wordprocessingCanvas" xmlns:cx="http://schemas.microsoft.com/office/drawing/2014/chartex" xmlns:cx1="http://schemas.microsoft.com/office/drawing/2015/9/8/chartex" xmlns:cx2="http://schemas.microsoft.com/office/drawing/2015/10/21/chartex" xmlns:cx3="http://schemas.microsoft.com/office/drawing/2016/5/9/chartex" xmlns:cx4="http://schemas.microsoft.com/office/drawing/2016/5/10/chartex" xmlns:cx5="http://schemas.microsoft.com/office/drawing/2016/5/11/chartex" xmlns:cx6="http://schemas.microsoft.com/office/drawing/2016/5/12/chartex" xmlns:cx7="http://schemas.microsoft.com/office/drawing/2016/5/13/chartex" xmlns:cx8="http://schemas.microsoft.com/office/drawing/2016/5/14/chartex" xmlns:mc="http://schemas.openxmlformats.org/markup-compatibility/2006" xmlns:m="http://schemas.openxmlformats.org/officeDocument/2006/math" xmlns:aink="http://schemas.microsoft.com/office/drawing/2016/ink" xmlns:am3d="http://schemas.microsoft.com/office/drawing/2017/model3d" xmlns:oel="http://schemas.microsoft.com/office/2019/extlst" xmlns:r="http://schemas.openxmlformats.org/officeDocument/2006/relationships" xmlns:wp14="http://schemas.microsoft.com/office/word/2010/wordprocessingDrawing" xmlns:wp="http://schemas.openxmlformats.org/drawingml/2006/wordprocessingDrawing" xmlns:wpg="http://schemas.microsoft.com/office/word/2010/wordprocessingGroup" xmlns:wpi="http://schemas.microsoft.com/office/word/2010/wordprocessingInk" xmlns:wps="http://schemas.microsoft.com/office/word/2010/wordprocessingShape" xmlns:o="urn:schemas-microsoft-com:office:office" xmlns:v="urn:schemas-microsoft-com:vml" xmlns:w10="urn:schemas-microsoft-com:office:word" xmlns:w="http://schemas.openxmlformats.org/wordprocessingml/2006/main" xmlns:w14="http://schemas.microsoft.com/office/word/2010/wordml" xmlns:w15="http://schemas.microsoft.com/office/word/2012/wordml" xmlns:w16cei="http://schemas.microsoft.com/office/word/2026/wordml/cei" xmlns:w16cex="http://schemas.microsoft.com/office/word/2018/wordml/cex" xmlns:w16cid="http://schemas.microsoft.com/office/word/2016/wordml/cid" xmlns:w16="http://schemas.microsoft.com/office/word/2018/wordml" xmlns:w16sdtdh="http://schemas.microsoft.com/office/word/2020/wordml/sdtdatahash" xmlns:w16sdtfl="http://schemas.microsoft.com/office/word/2024/wordml/sdtformatlock" xmlns:w16se="http://schemas.microsoft.com/office/word/2015/wordml/symex" xmlns:w16du="http://schemas.microsoft.com/office/word/2023/wordml/word16du" xmlns:wne="http://schemas.microsoft.com/office/word/2006/wordml" mc:Ignorable="w14 w15 w16se w16cid w16 w16cex w16sdtdh w16sdtfl w16du wp14">
+<w:endnotes xmlns:wpc="http://schemas.microsoft.com/office/word/2010/wordprocessingCanvas" xmlns:cx="http://schemas.microsoft.com/office/drawing/2014/chartex" xmlns:cx1="http://schemas.microsoft.com/office/drawing/2015/9/8/chartex" xmlns:cx2="http://schemas.microsoft.com/office/drawing/2015/10/21/chartex" xmlns:cx3="http://schemas.microsoft.com/office/drawing/2016/5/9/chartex" xmlns:cx4="http://schemas.microsoft.com/office/drawing/2016/5/10/chartex" xmlns:cx5="http://schemas.microsoft.com/office/drawing/2016/5/11/chartex" xmlns:cx6="http://schemas.microsoft.com/office/drawing/2016/5/12/chartex" xmlns:cx7="http://schemas.microsoft.com/office/drawing/2016/5/13/chartex" xmlns:cx8="http://schemas.microsoft.com/office/drawing/2016/5/14/chartex" xmlns:mc="http://schemas.openxmlformats.org/markup-compatibility/2006" xmlns:m="http://schemas.openxmlformats.org/officeDocument/2006/math" xmlns:aink="http://schemas.microsoft.com/office/drawing/2016/ink" xmlns:am3d="http://schemas.microsoft.com/office/drawing/2017/model3d" xmlns:oel="http://schemas.microsoft.com/office/2019/extlst" xmlns:r="http://schemas.openxmlformats.org/officeDocument/2006/relationships" xmlns:wp14="http://schemas.microsoft.com/office/word/2010/wordprocessingDrawing" xmlns:wp="http://schemas.openxmlformats.org/drawingml/2006/wordprocessingDrawing" xmlns:wpg="http://schemas.microsoft.com/office/word/2010/wordprocessingGroup" xmlns:wpi="http://schemas.microsoft.com/office/word/2010/wordprocessingInk" xmlns:wps="http://schemas.microsoft.com/office/word/2010/wordprocessingShape" xmlns:o="urn:schemas-microsoft-com:office:office" xmlns:v="urn:schemas-microsoft-com:vml" xmlns:w10="urn:schemas-microsoft-com:office:word" xmlns:w="http://schemas.openxmlformats.org/wordprocessingml/2006/main" xmlns:w14="http://schemas.microsoft.com/office/word/2010/wordml" xmlns:w15="http://schemas.microsoft.com/office/word/2012/wordml" xmlns:w16cex="http://schemas.microsoft.com/office/word/2018/wordml/cex" xmlns:w16cid="http://schemas.microsoft.com/office/word/2016/wordml/cid" xmlns:w16="http://schemas.microsoft.com/office/word/2018/wordml" xmlns:w16sdtdh="http://schemas.microsoft.com/office/word/2020/wordml/sdtdatahash" xmlns:w16sdtfl="http://schemas.microsoft.com/office/word/2024/wordml/sdtformatlock" xmlns:w16se="http://schemas.microsoft.com/office/word/2015/wordml/symex" xmlns:w16du="http://schemas.microsoft.com/office/word/2023/wordml/word16du" xmlns:wne="http://schemas.microsoft.com/office/word/2006/wordml" mc:Ignorable="w14 w15 w16se w16cid w16 w16cex w16sdtdh w16sdtfl w16du wp14">
   <w:endnote w:type="separator" w:id="-1">
     <w:p>
       <w:r>
@@ -5517,7 +5553,7 @@
 </file>
 
 <file path=word/footer1.xml><?xml version="1.0" encoding="utf-8"?>
-<w:ftr xmlns:wpc="http://schemas.microsoft.com/office/word/2010/wordprocessingCanvas" xmlns:cx="http://schemas.microsoft.com/office/drawing/2014/chartex" xmlns:cx1="http://schemas.microsoft.com/office/drawing/2015/9/8/chartex" xmlns:cx2="http://schemas.microsoft.com/office/drawing/2015/10/21/chartex" xmlns:cx3="http://schemas.microsoft.com/office/drawing/2016/5/9/chartex" xmlns:cx4="http://schemas.microsoft.com/office/drawing/2016/5/10/chartex" xmlns:cx5="http://schemas.microsoft.com/office/drawing/2016/5/11/chartex" xmlns:cx6="http://schemas.microsoft.com/office/drawing/2016/5/12/chartex" xmlns:cx7="http://schemas.microsoft.com/office/drawing/2016/5/13/chartex" xmlns:cx8="http://schemas.microsoft.com/office/drawing/2016/5/14/chartex" xmlns:mc="http://schemas.openxmlformats.org/markup-compatibility/2006" xmlns:m="http://schemas.openxmlformats.org/officeDocument/2006/math" xmlns:aink="http://schemas.microsoft.com/office/drawing/2016/ink" xmlns:am3d="http://schemas.microsoft.com/office/drawing/2017/model3d" xmlns:oel="http://schemas.microsoft.com/office/2019/extlst" xmlns:r="http://schemas.openxmlformats.org/officeDocument/2006/relationships" xmlns:wp14="http://schemas.microsoft.com/office/word/2010/wordprocessingDrawing" xmlns:wp="http://schemas.openxmlformats.org/drawingml/2006/wordprocessingDrawing" xmlns:wpg="http://schemas.microsoft.com/office/word/2010/wordprocessingGroup" xmlns:wpi="http://schemas.microsoft.com/office/word/2010/wordprocessingInk" xmlns:wps="http://schemas.microsoft.com/office/word/2010/wordprocessingShape" xmlns:o="urn:schemas-microsoft-com:office:office" xmlns:v="urn:schemas-microsoft-com:vml" xmlns:w10="urn:schemas-microsoft-com:office:word" xmlns:w="http://schemas.openxmlformats.org/wordprocessingml/2006/main" xmlns:w14="http://schemas.microsoft.com/office/word/2010/wordml" xmlns:w15="http://schemas.microsoft.com/office/word/2012/wordml" xmlns:w16cei="http://schemas.microsoft.com/office/word/2026/wordml/cei" xmlns:w16cex="http://schemas.microsoft.com/office/word/2018/wordml/cex" xmlns:w16cid="http://schemas.microsoft.com/office/word/2016/wordml/cid" xmlns:w16="http://schemas.microsoft.com/office/word/2018/wordml" xmlns:w16sdtdh="http://schemas.microsoft.com/office/word/2020/wordml/sdtdatahash" xmlns:w16sdtfl="http://schemas.microsoft.com/office/word/2024/wordml/sdtformatlock" xmlns:w16se="http://schemas.microsoft.com/office/word/2015/wordml/symex" xmlns:w16du="http://schemas.microsoft.com/office/word/2023/wordml/word16du" xmlns:wne="http://schemas.microsoft.com/office/word/2006/wordml" mc:Ignorable="w14 w15 w16se w16cid w16 w16cex w16sdtdh w16sdtfl w16du wp14">
+<w:ftr xmlns:wpc="http://schemas.microsoft.com/office/word/2010/wordprocessingCanvas" xmlns:cx="http://schemas.microsoft.com/office/drawing/2014/chartex" xmlns:cx1="http://schemas.microsoft.com/office/drawing/2015/9/8/chartex" xmlns:cx2="http://schemas.microsoft.com/office/drawing/2015/10/21/chartex" xmlns:cx3="http://schemas.microsoft.com/office/drawing/2016/5/9/chartex" xmlns:cx4="http://schemas.microsoft.com/office/drawing/2016/5/10/chartex" xmlns:cx5="http://schemas.microsoft.com/office/drawing/2016/5/11/chartex" xmlns:cx6="http://schemas.microsoft.com/office/drawing/2016/5/12/chartex" xmlns:cx7="http://schemas.microsoft.com/office/drawing/2016/5/13/chartex" xmlns:cx8="http://schemas.microsoft.com/office/drawing/2016/5/14/chartex" xmlns:mc="http://schemas.openxmlformats.org/markup-compatibility/2006" xmlns:m="http://schemas.openxmlformats.org/officeDocument/2006/math" xmlns:aink="http://schemas.microsoft.com/office/drawing/2016/ink" xmlns:am3d="http://schemas.microsoft.com/office/drawing/2017/model3d" xmlns:oel="http://schemas.microsoft.com/office/2019/extlst" xmlns:r="http://schemas.openxmlformats.org/officeDocument/2006/relationships" xmlns:wp14="http://schemas.microsoft.com/office/word/2010/wordprocessingDrawing" xmlns:wp="http://schemas.openxmlformats.org/drawingml/2006/wordprocessingDrawing" xmlns:wpg="http://schemas.microsoft.com/office/word/2010/wordprocessingGroup" xmlns:wpi="http://schemas.microsoft.com/office/word/2010/wordprocessingInk" xmlns:wps="http://schemas.microsoft.com/office/word/2010/wordprocessingShape" xmlns:o="urn:schemas-microsoft-com:office:office" xmlns:v="urn:schemas-microsoft-com:vml" xmlns:w10="urn:schemas-microsoft-com:office:word" xmlns:w="http://schemas.openxmlformats.org/wordprocessingml/2006/main" xmlns:w14="http://schemas.microsoft.com/office/word/2010/wordml" xmlns:w15="http://schemas.microsoft.com/office/word/2012/wordml" xmlns:w16cex="http://schemas.microsoft.com/office/word/2018/wordml/cex" xmlns:w16cid="http://schemas.microsoft.com/office/word/2016/wordml/cid" xmlns:w16="http://schemas.microsoft.com/office/word/2018/wordml" xmlns:w16sdtdh="http://schemas.microsoft.com/office/word/2020/wordml/sdtdatahash" xmlns:w16sdtfl="http://schemas.microsoft.com/office/word/2024/wordml/sdtformatlock" xmlns:w16se="http://schemas.microsoft.com/office/word/2015/wordml/symex" xmlns:w16du="http://schemas.microsoft.com/office/word/2023/wordml/word16du" xmlns:wne="http://schemas.microsoft.com/office/word/2006/wordml" mc:Ignorable="w14 w15 w16se w16cid w16 w16cex w16sdtdh w16sdtfl w16du wp14">
   <w:p>
     <w:pPr>
       <w:jc w:val="center"/>
@@ -5576,7 +5612,7 @@
 </file>
 
 <file path=word/footnotes.xml><?xml version="1.0" encoding="utf-8"?>
-<w:footnotes xmlns:wpc="http://schemas.microsoft.com/office/word/2010/wordprocessingCanvas" xmlns:cx="http://schemas.microsoft.com/office/drawing/2014/chartex" xmlns:cx1="http://schemas.microsoft.com/office/drawing/2015/9/8/chartex" xmlns:cx2="http://schemas.microsoft.com/office/drawing/2015/10/21/chartex" xmlns:cx3="http://schemas.microsoft.com/office/drawing/2016/5/9/chartex" xmlns:cx4="http://schemas.microsoft.com/office/drawing/2016/5/10/chartex" xmlns:cx5="http://schemas.microsoft.com/office/drawing/2016/5/11/chartex" xmlns:cx6="http://schemas.microsoft.com/office/drawing/2016/5/12/chartex" xmlns:cx7="http://schemas.microsoft.com/office/drawing/2016/5/13/chartex" xmlns:cx8="http://schemas.microsoft.com/office/drawing/2016/5/14/chartex" xmlns:mc="http://schemas.openxmlformats.org/markup-compatibility/2006" xmlns:m="http://schemas.openxmlformats.org/officeDocument/2006/math" xmlns:aink="http://schemas.microsoft.com/office/drawing/2016/ink" xmlns:am3d="http://schemas.microsoft.com/office/drawing/2017/model3d" xmlns:oel="http://schemas.microsoft.com/office/2019/extlst" xmlns:r="http://schemas.openxmlformats.org/officeDocument/2006/relationships" xmlns:wp14="http://schemas.microsoft.com/office/word/2010/wordprocessingDrawing" xmlns:wp="http://schemas.openxmlformats.org/drawingml/2006/wordprocessingDrawing" xmlns:wpg="http://schemas.microsoft.com/office/word/2010/wordprocessingGroup" xmlns:wpi="http://schemas.microsoft.com/office/word/2010/wordprocessingInk" xmlns:wps="http://schemas.microsoft.com/office/word/2010/wordprocessingShape" xmlns:o="urn:schemas-microsoft-com:office:office" xmlns:v="urn:schemas-microsoft-com:vml" xmlns:w10="urn:schemas-microsoft-com:office:word" xmlns:w="http://schemas.openxmlformats.org/wordprocessingml/2006/main" xmlns:w14="http://schemas.microsoft.com/office/word/2010/wordml" xmlns:w15="http://schemas.microsoft.com/office/word/2012/wordml" xmlns:w16cei="http://schemas.microsoft.com/office/word/2026/wordml/cei" xmlns:w16cex="http://schemas.microsoft.com/office/word/2018/wordml/cex" xmlns:w16cid="http://schemas.microsoft.com/office/word/2016/wordml/cid" xmlns:w16="http://schemas.microsoft.com/office/word/2018/wordml" xmlns:w16sdtdh="http://schemas.microsoft.com/office/word/2020/wordml/sdtdatahash" xmlns:w16sdtfl="http://schemas.microsoft.com/office/word/2024/wordml/sdtformatlock" xmlns:w16se="http://schemas.microsoft.com/office/word/2015/wordml/symex" xmlns:w16du="http://schemas.microsoft.com/office/word/2023/wordml/word16du" xmlns:wne="http://schemas.microsoft.com/office/word/2006/wordml" mc:Ignorable="w14 w15 w16se w16cid w16 w16cex w16sdtdh w16sdtfl w16du wp14">
+<w:footnotes xmlns:wpc="http://schemas.microsoft.com/office/word/2010/wordprocessingCanvas" xmlns:cx="http://schemas.microsoft.com/office/drawing/2014/chartex" xmlns:cx1="http://schemas.microsoft.com/office/drawing/2015/9/8/chartex" xmlns:cx2="http://schemas.microsoft.com/office/drawing/2015/10/21/chartex" xmlns:cx3="http://schemas.microsoft.com/office/drawing/2016/5/9/chartex" xmlns:cx4="http://schemas.microsoft.com/office/drawing/2016/5/10/chartex" xmlns:cx5="http://schemas.microsoft.com/office/drawing/2016/5/11/chartex" xmlns:cx6="http://schemas.microsoft.com/office/drawing/2016/5/12/chartex" xmlns:cx7="http://schemas.microsoft.com/office/drawing/2016/5/13/chartex" xmlns:cx8="http://schemas.microsoft.com/office/drawing/2016/5/14/chartex" xmlns:mc="http://schemas.openxmlformats.org/markup-compatibility/2006" xmlns:m="http://schemas.openxmlformats.org/officeDocument/2006/math" xmlns:aink="http://schemas.microsoft.com/office/drawing/2016/ink" xmlns:am3d="http://schemas.microsoft.com/office/drawing/2017/model3d" xmlns:oel="http://schemas.microsoft.com/office/2019/extlst" xmlns:r="http://schemas.openxmlformats.org/officeDocument/2006/relationships" xmlns:wp14="http://schemas.microsoft.com/office/word/2010/wordprocessingDrawing" xmlns:wp="http://schemas.openxmlformats.org/drawingml/2006/wordprocessingDrawing" xmlns:wpg="http://schemas.microsoft.com/office/word/2010/wordprocessingGroup" xmlns:wpi="http://schemas.microsoft.com/office/word/2010/wordprocessingInk" xmlns:wps="http://schemas.microsoft.com/office/word/2010/wordprocessingShape" xmlns:o="urn:schemas-microsoft-com:office:office" xmlns:v="urn:schemas-microsoft-com:vml" xmlns:w10="urn:schemas-microsoft-com:office:word" xmlns:w="http://schemas.openxmlformats.org/wordprocessingml/2006/main" xmlns:w14="http://schemas.microsoft.com/office/word/2010/wordml" xmlns:w15="http://schemas.microsoft.com/office/word/2012/wordml" xmlns:w16cex="http://schemas.microsoft.com/office/word/2018/wordml/cex" xmlns:w16cid="http://schemas.microsoft.com/office/word/2016/wordml/cid" xmlns:w16="http://schemas.microsoft.com/office/word/2018/wordml" xmlns:w16sdtdh="http://schemas.microsoft.com/office/word/2020/wordml/sdtdatahash" xmlns:w16sdtfl="http://schemas.microsoft.com/office/word/2024/wordml/sdtformatlock" xmlns:w16se="http://schemas.microsoft.com/office/word/2015/wordml/symex" xmlns:w16du="http://schemas.microsoft.com/office/word/2023/wordml/word16du" xmlns:wne="http://schemas.microsoft.com/office/word/2006/wordml" mc:Ignorable="w14 w15 w16se w16cid w16 w16cex w16sdtdh w16sdtfl w16du wp14">
   <w:footnote w:type="separator" w:id="-1">
     <w:p>
       <w:r>
@@ -5595,7 +5631,7 @@
 </file>
 
 <file path=word/header1.xml><?xml version="1.0" encoding="utf-8"?>
-<w:hdr xmlns:wpc="http://schemas.microsoft.com/office/word/2010/wordprocessingCanvas" xmlns:cx="http://schemas.microsoft.com/office/drawing/2014/chartex" xmlns:cx1="http://schemas.microsoft.com/office/drawing/2015/9/8/chartex" xmlns:cx2="http://schemas.microsoft.com/office/drawing/2015/10/21/chartex" xmlns:cx3="http://schemas.microsoft.com/office/drawing/2016/5/9/chartex" xmlns:cx4="http://schemas.microsoft.com/office/drawing/2016/5/10/chartex" xmlns:cx5="http://schemas.microsoft.com/office/drawing/2016/5/11/chartex" xmlns:cx6="http://schemas.microsoft.com/office/drawing/2016/5/12/chartex" xmlns:cx7="http://schemas.microsoft.com/office/drawing/2016/5/13/chartex" xmlns:cx8="http://schemas.microsoft.com/office/drawing/2016/5/14/chartex" xmlns:mc="http://schemas.openxmlformats.org/markup-compatibility/2006" xmlns:m="http://schemas.openxmlformats.org/officeDocument/2006/math" xmlns:aink="http://schemas.microsoft.com/office/drawing/2016/ink" xmlns:am3d="http://schemas.microsoft.com/office/drawing/2017/model3d" xmlns:oel="http://schemas.microsoft.com/office/2019/extlst" xmlns:r="http://schemas.openxmlformats.org/officeDocument/2006/relationships" xmlns:wp14="http://schemas.microsoft.com/office/word/2010/wordprocessingDrawing" xmlns:wp="http://schemas.openxmlformats.org/drawingml/2006/wordprocessingDrawing" xmlns:wpg="http://schemas.microsoft.com/office/word/2010/wordprocessingGroup" xmlns:wpi="http://schemas.microsoft.com/office/word/2010/wordprocessingInk" xmlns:wps="http://schemas.microsoft.com/office/word/2010/wordprocessingShape" xmlns:o="urn:schemas-microsoft-com:office:office" xmlns:v="urn:schemas-microsoft-com:vml" xmlns:w10="urn:schemas-microsoft-com:office:word" xmlns:w="http://schemas.openxmlformats.org/wordprocessingml/2006/main" xmlns:w14="http://schemas.microsoft.com/office/word/2010/wordml" xmlns:w15="http://schemas.microsoft.com/office/word/2012/wordml" xmlns:w16cei="http://schemas.microsoft.com/office/word/2026/wordml/cei" xmlns:w16cex="http://schemas.microsoft.com/office/word/2018/wordml/cex" xmlns:w16cid="http://schemas.microsoft.com/office/word/2016/wordml/cid" xmlns:w16="http://schemas.microsoft.com/office/word/2018/wordml" xmlns:w16sdtdh="http://schemas.microsoft.com/office/word/2020/wordml/sdtdatahash" xmlns:w16sdtfl="http://schemas.microsoft.com/office/word/2024/wordml/sdtformatlock" xmlns:w16se="http://schemas.microsoft.com/office/word/2015/wordml/symex" xmlns:w16du="http://schemas.microsoft.com/office/word/2023/wordml/word16du" xmlns:wne="http://schemas.microsoft.com/office/word/2006/wordml" mc:Ignorable="w14 w15 w16se w16cid w16 w16cex w16sdtdh w16sdtfl w16du wp14">
+<w:hdr xmlns:wpc="http://schemas.microsoft.com/office/word/2010/wordprocessingCanvas" xmlns:cx="http://schemas.microsoft.com/office/drawing/2014/chartex" xmlns:cx1="http://schemas.microsoft.com/office/drawing/2015/9/8/chartex" xmlns:cx2="http://schemas.microsoft.com/office/drawing/2015/10/21/chartex" xmlns:cx3="http://schemas.microsoft.com/office/drawing/2016/5/9/chartex" xmlns:cx4="http://schemas.microsoft.com/office/drawing/2016/5/10/chartex" xmlns:cx5="http://schemas.microsoft.com/office/drawing/2016/5/11/chartex" xmlns:cx6="http://schemas.microsoft.com/office/drawing/2016/5/12/chartex" xmlns:cx7="http://schemas.microsoft.com/office/drawing/2016/5/13/chartex" xmlns:cx8="http://schemas.microsoft.com/office/drawing/2016/5/14/chartex" xmlns:mc="http://schemas.openxmlformats.org/markup-compatibility/2006" xmlns:m="http://schemas.openxmlformats.org/officeDocument/2006/math" xmlns:aink="http://schemas.microsoft.com/office/drawing/2016/ink" xmlns:am3d="http://schemas.microsoft.com/office/drawing/2017/model3d" xmlns:oel="http://schemas.microsoft.com/office/2019/extlst" xmlns:r="http://schemas.openxmlformats.org/officeDocument/2006/relationships" xmlns:wp14="http://schemas.microsoft.com/office/word/2010/wordprocessingDrawing" xmlns:wp="http://schemas.openxmlformats.org/drawingml/2006/wordprocessingDrawing" xmlns:wpg="http://schemas.microsoft.com/office/word/2010/wordprocessingGroup" xmlns:wpi="http://schemas.microsoft.com/office/word/2010/wordprocessingInk" xmlns:wps="http://schemas.microsoft.com/office/word/2010/wordprocessingShape" xmlns:o="urn:schemas-microsoft-com:office:office" xmlns:v="urn:schemas-microsoft-com:vml" xmlns:w10="urn:schemas-microsoft-com:office:word" xmlns:w="http://schemas.openxmlformats.org/wordprocessingml/2006/main" xmlns:w14="http://schemas.microsoft.com/office/word/2010/wordml" xmlns:w15="http://schemas.microsoft.com/office/word/2012/wordml" xmlns:w16cex="http://schemas.microsoft.com/office/word/2018/wordml/cex" xmlns:w16cid="http://schemas.microsoft.com/office/word/2016/wordml/cid" xmlns:w16="http://schemas.microsoft.com/office/word/2018/wordml" xmlns:w16sdtdh="http://schemas.microsoft.com/office/word/2020/wordml/sdtdatahash" xmlns:w16sdtfl="http://schemas.microsoft.com/office/word/2024/wordml/sdtformatlock" xmlns:w16se="http://schemas.microsoft.com/office/word/2015/wordml/symex" xmlns:w16du="http://schemas.microsoft.com/office/word/2023/wordml/word16du" xmlns:wne="http://schemas.microsoft.com/office/word/2006/wordml" mc:Ignorable="w14 w15 w16se w16cid w16 w16cex w16sdtdh w16sdtfl w16du wp14">
   <w:p>
     <w:pPr>
       <w:pBdr>
@@ -5629,7 +5665,7 @@
 </file>
 
 <file path=word/numbering.xml><?xml version="1.0" encoding="utf-8"?>
-<w:numbering xmlns:wpc="http://schemas.microsoft.com/office/word/2010/wordprocessingCanvas" xmlns:cx="http://schemas.microsoft.com/office/drawing/2014/chartex" xmlns:cx1="http://schemas.microsoft.com/office/drawing/2015/9/8/chartex" xmlns:cx2="http://schemas.microsoft.com/office/drawing/2015/10/21/chartex" xmlns:cx3="http://schemas.microsoft.com/office/drawing/2016/5/9/chartex" xmlns:cx4="http://schemas.microsoft.com/office/drawing/2016/5/10/chartex" xmlns:cx5="http://schemas.microsoft.com/office/drawing/2016/5/11/chartex" xmlns:cx6="http://schemas.microsoft.com/office/drawing/2016/5/12/chartex" xmlns:cx7="http://schemas.microsoft.com/office/drawing/2016/5/13/chartex" xmlns:cx8="http://schemas.microsoft.com/office/drawing/2016/5/14/chartex" xmlns:mc="http://schemas.openxmlformats.org/markup-compatibility/2006" xmlns:m="http://schemas.openxmlformats.org/officeDocument/2006/math" xmlns:aink="http://schemas.microsoft.com/office/drawing/2016/ink" xmlns:am3d="http://schemas.microsoft.com/office/drawing/2017/model3d" xmlns:oel="http://schemas.microsoft.com/office/2019/extlst" xmlns:r="http://schemas.openxmlformats.org/officeDocument/2006/relationships" xmlns:wp14="http://schemas.microsoft.com/office/word/2010/wordprocessingDrawing" xmlns:wp="http://schemas.openxmlformats.org/drawingml/2006/wordprocessingDrawing" xmlns:wpg="http://schemas.microsoft.com/office/word/2010/wordprocessingGroup" xmlns:wpi="http://schemas.microsoft.com/office/word/2010/wordprocessingInk" xmlns:wps="http://schemas.microsoft.com/office/word/2010/wordprocessingShape" xmlns:o="urn:schemas-microsoft-com:office:office" xmlns:v="urn:schemas-microsoft-com:vml" xmlns:w10="urn:schemas-microsoft-com:office:word" xmlns:w="http://schemas.openxmlformats.org/wordprocessingml/2006/main" xmlns:w14="http://schemas.microsoft.com/office/word/2010/wordml" xmlns:w15="http://schemas.microsoft.com/office/word/2012/wordml" xmlns:w16cei="http://schemas.microsoft.com/office/word/2026/wordml/cei" xmlns:w16cex="http://schemas.microsoft.com/office/word/2018/wordml/cex" xmlns:w16cid="http://schemas.microsoft.com/office/word/2016/wordml/cid" xmlns:w16="http://schemas.microsoft.com/office/word/2018/wordml" xmlns:w16sdtdh="http://schemas.microsoft.com/office/word/2020/wordml/sdtdatahash" xmlns:w16sdtfl="http://schemas.microsoft.com/office/word/2024/wordml/sdtformatlock" xmlns:w16se="http://schemas.microsoft.com/office/word/2015/wordml/symex" xmlns:w16du="http://schemas.microsoft.com/office/word/2023/wordml/word16du" xmlns:wne="http://schemas.microsoft.com/office/word/2006/wordml" mc:Ignorable="w14 w15 w16se w16cid w16 w16cex w16sdtdh w16sdtfl w16du wp14">
+<w:numbering xmlns:wpc="http://schemas.microsoft.com/office/word/2010/wordprocessingCanvas" xmlns:cx="http://schemas.microsoft.com/office/drawing/2014/chartex" xmlns:cx1="http://schemas.microsoft.com/office/drawing/2015/9/8/chartex" xmlns:cx2="http://schemas.microsoft.com/office/drawing/2015/10/21/chartex" xmlns:cx3="http://schemas.microsoft.com/office/drawing/2016/5/9/chartex" xmlns:cx4="http://schemas.microsoft.com/office/drawing/2016/5/10/chartex" xmlns:cx5="http://schemas.microsoft.com/office/drawing/2016/5/11/chartex" xmlns:cx6="http://schemas.microsoft.com/office/drawing/2016/5/12/chartex" xmlns:cx7="http://schemas.microsoft.com/office/drawing/2016/5/13/chartex" xmlns:cx8="http://schemas.microsoft.com/office/drawing/2016/5/14/chartex" xmlns:mc="http://schemas.openxmlformats.org/markup-compatibility/2006" xmlns:m="http://schemas.openxmlformats.org/officeDocument/2006/math" xmlns:aink="http://schemas.microsoft.com/office/drawing/2016/ink" xmlns:am3d="http://schemas.microsoft.com/office/drawing/2017/model3d" xmlns:oel="http://schemas.microsoft.com/office/2019/extlst" xmlns:r="http://schemas.openxmlformats.org/officeDocument/2006/relationships" xmlns:wp14="http://schemas.microsoft.com/office/word/2010/wordprocessingDrawing" xmlns:wp="http://schemas.openxmlformats.org/drawingml/2006/wordprocessingDrawing" xmlns:wpg="http://schemas.microsoft.com/office/word/2010/wordprocessingGroup" xmlns:wpi="http://schemas.microsoft.com/office/word/2010/wordprocessingInk" xmlns:wps="http://schemas.microsoft.com/office/word/2010/wordprocessingShape" xmlns:o="urn:schemas-microsoft-com:office:office" xmlns:v="urn:schemas-microsoft-com:vml" xmlns:w10="urn:schemas-microsoft-com:office:word" xmlns:w="http://schemas.openxmlformats.org/wordprocessingml/2006/main" xmlns:w14="http://schemas.microsoft.com/office/word/2010/wordml" xmlns:w15="http://schemas.microsoft.com/office/word/2012/wordml" xmlns:w16cex="http://schemas.microsoft.com/office/word/2018/wordml/cex" xmlns:w16cid="http://schemas.microsoft.com/office/word/2016/wordml/cid" xmlns:w16="http://schemas.microsoft.com/office/word/2018/wordml" xmlns:w16sdtdh="http://schemas.microsoft.com/office/word/2020/wordml/sdtdatahash" xmlns:w16sdtfl="http://schemas.microsoft.com/office/word/2024/wordml/sdtformatlock" xmlns:w16se="http://schemas.microsoft.com/office/word/2015/wordml/symex" xmlns:w16du="http://schemas.microsoft.com/office/word/2023/wordml/word16du" xmlns:wne="http://schemas.microsoft.com/office/word/2006/wordml" mc:Ignorable="w14 w15 w16se w16cid w16 w16cex w16sdtdh w16sdtfl w16du wp14">
   <w:abstractNum w:abstractNumId="0" w15:restartNumberingAfterBreak="0">
     <w:nsid w:val="17D21BB1"/>
     <w:multiLevelType w:val="hybridMultilevel"/>
@@ -6458,6 +6494,16 @@
     <w:semiHidden/>
     <w:rsid w:val="005056A3"/>
   </w:style>
+  <w:style w:type="character" w:styleId="PlaceholderText">
+    <w:name w:val="Placeholder Text"/>
+    <w:basedOn w:val="DefaultParagraphFont"/>
+    <w:uiPriority w:val="99"/>
+    <w:semiHidden/>
+    <w:rsid w:val="003B30EB"/>
+    <w:rPr>
+      <w:color w:val="666666"/>
+    </w:rPr>
+  </w:style>
 </w:styles>
 </file>
 

</xml_diff>